<commit_message>
feat(data): complete the VoltHaven knowledge base
Adds 13 policies, SOPs, guides, templates and a compliance guideline
(20 active documents) plus an archived Delivery Policy v1.0, and new
versions of four edited documents. A test proves every policy reference
in the rule matrix resolves to a real document section.

Co-Authored-By: Claude Opus 5.5 <noreply@anthropic.com>
</commit_message>
<xml_diff>
--- a/sample_documents/generated/ESC-PRC-01_escalation-procedure.docx
+++ b/sample_documents/generated/ESC-PRC-01_escalation-procedure.docx
@@ -22,7 +22,7 @@
     </w:p>
     <w:p>
       <w:r>
-        <w:t>Version: 2.2</w:t>
+        <w:t>Version: 2.3</w:t>
       </w:r>
     </w:p>
     <w:p>
@@ -150,6 +150,19 @@
     <w:p>
       <w:r>
         <w:t>Any request that can only be met by an exception to company policy requires Supervisor Review (Level 1) before the customer is promised anything.</w:t>
+      </w:r>
+    </w:p>
+    <w:p>
+      <w:pPr>
+        <w:pStyle w:val="Heading2"/>
+      </w:pPr>
+      <w:r>
+        <w:t>3.7 Severe Service Failures</w:t>
+      </w:r>
+    </w:p>
+    <w:p>
+      <w:r>
+        <w:t>An order more than 15 business days late, or a replacement or repair chased again after an earlier complaint, requires Supervisor Review (Level 1).</w:t>
       </w:r>
     </w:p>
     <w:p>

</xml_diff>